<commit_message>
feat: enhance text replacement logic and add regression tests for BAPP PML Termin 2
</commit_message>
<xml_diff>
--- a/template/03. Template BAPP T2 PML.docx
+++ b/template/03. Template BAPP T2 PML.docx
@@ -882,25 +882,7 @@
           <w:sz w:val="24"/>
           <w:szCs w:val="24"/>
         </w:rPr>
-        <w:t xml:space="preserve"> </w:t>
-      </w:r>
-      <w:proofErr w:type="spellStart"/>
-      <w:r>
-        <w:rPr>
-          <w:rFonts w:ascii="Bookman Old Style" w:eastAsia="Bookman Old Style" w:hAnsi="Bookman Old Style" w:cs="Bookman Old Style"/>
-          <w:sz w:val="24"/>
-          <w:szCs w:val="24"/>
-        </w:rPr>
-        <w:t>hal</w:t>
-      </w:r>
-      <w:proofErr w:type="spellEnd"/>
-      <w:r>
-        <w:rPr>
-          <w:rFonts w:ascii="Bookman Old Style" w:eastAsia="Bookman Old Style" w:hAnsi="Bookman Old Style" w:cs="Bookman Old Style"/>
-          <w:sz w:val="24"/>
-          <w:szCs w:val="24"/>
-        </w:rPr>
-        <w:t xml:space="preserve"> </w:t>
+        <w:t xml:space="preserve"> hal </w:t>
       </w:r>
       <w:proofErr w:type="spellStart"/>
       <w:r>
@@ -1707,6 +1689,7 @@
         <w:t xml:space="preserve"> </w:t>
       </w:r>
       <w:proofErr w:type="spellStart"/>
+      <w:proofErr w:type="gramStart"/>
       <w:r>
         <w:rPr>
           <w:rFonts w:ascii="Bookman Old Style" w:eastAsia="Bookman Old Style" w:hAnsi="Bookman Old Style" w:cs="Bookman Old Style"/>
@@ -1737,6 +1720,7 @@
         <w:t>pekerjaan</w:t>
       </w:r>
       <w:proofErr w:type="spellEnd"/>
+      <w:proofErr w:type="gramEnd"/>
       <w:r>
         <w:rPr>
           <w:rFonts w:ascii="Bookman Old Style" w:eastAsia="Bookman Old Style" w:hAnsi="Bookman Old Style" w:cs="Bookman Old Style"/>
@@ -1786,6 +1770,7 @@
         <w:t xml:space="preserve"> </w:t>
       </w:r>
       <w:proofErr w:type="spellStart"/>
+      <w:proofErr w:type="gramStart"/>
       <w:r>
         <w:rPr>
           <w:rFonts w:ascii="Bookman Old Style" w:eastAsia="Bookman Old Style" w:hAnsi="Bookman Old Style" w:cs="Bookman Old Style"/>
@@ -1803,7 +1788,17 @@
           <w:sz w:val="24"/>
           <w:szCs w:val="24"/>
         </w:rPr>
-        <w:t xml:space="preserve">  Sensus Ekonomi 2026 pada Badan Pusat </w:t>
+        <w:t>  Sensus</w:t>
+      </w:r>
+      <w:proofErr w:type="gramEnd"/>
+      <w:r>
+        <w:rPr>
+          <w:rFonts w:ascii="Bookman Old Style" w:eastAsia="Bookman Old Style" w:hAnsi="Bookman Old Style" w:cs="Bookman Old Style"/>
+          <w:color w:val="000000"/>
+          <w:sz w:val="24"/>
+          <w:szCs w:val="24"/>
+        </w:rPr>
+        <w:t xml:space="preserve"> Ekonomi 2026 pada Badan Pusat </w:t>
       </w:r>
       <w:proofErr w:type="spellStart"/>
       <w:r>
@@ -2686,6 +2681,7 @@
         <w:t xml:space="preserve"> </w:t>
       </w:r>
       <w:proofErr w:type="spellStart"/>
+      <w:proofErr w:type="gramStart"/>
       <w:r>
         <w:rPr>
           <w:rFonts w:ascii="Bookman Old Style" w:eastAsia="Bookman Old Style" w:hAnsi="Bookman Old Style" w:cs="Bookman Old Style"/>
@@ -2703,7 +2699,17 @@
           <w:sz w:val="24"/>
           <w:szCs w:val="24"/>
         </w:rPr>
-        <w:t xml:space="preserve">  Sensus Ekonomi 2026 </w:t>
+        <w:t>  Sensus</w:t>
+      </w:r>
+      <w:proofErr w:type="gramEnd"/>
+      <w:r>
+        <w:rPr>
+          <w:rFonts w:ascii="Bookman Old Style" w:eastAsia="Bookman Old Style" w:hAnsi="Bookman Old Style" w:cs="Bookman Old Style"/>
+          <w:color w:val="000000"/>
+          <w:sz w:val="24"/>
+          <w:szCs w:val="24"/>
+        </w:rPr>
+        <w:t xml:space="preserve"> Ekonomi 2026 </w:t>
       </w:r>
       <w:proofErr w:type="spellStart"/>
       <w:r>
@@ -6114,26 +6120,6 @@
     </w:p>
     <w:p>
       <w:pPr>
-        <w:spacing w:after="0" w:line="240" w:lineRule="auto"/>
-        <w:rPr>
-          <w:rFonts w:ascii="Times New Roman" w:eastAsia="Times New Roman" w:hAnsi="Times New Roman" w:cs="Times New Roman"/>
-          <w:sz w:val="24"/>
-          <w:szCs w:val="24"/>
-        </w:rPr>
-      </w:pPr>
-    </w:p>
-    <w:p>
-      <w:pPr>
-        <w:spacing w:after="0" w:line="240" w:lineRule="auto"/>
-        <w:rPr>
-          <w:rFonts w:ascii="Times New Roman" w:eastAsia="Times New Roman" w:hAnsi="Times New Roman" w:cs="Times New Roman"/>
-          <w:sz w:val="24"/>
-          <w:szCs w:val="24"/>
-        </w:rPr>
-      </w:pPr>
-    </w:p>
-    <w:p>
-      <w:pPr>
         <w:numPr>
           <w:ilvl w:val="0"/>
           <w:numId w:val="2"/>
@@ -6153,6 +6139,7 @@
           <w:sz w:val="24"/>
           <w:szCs w:val="24"/>
         </w:rPr>
+        <w:lastRenderedPageBreak/>
         <w:t>BUKTI PENCAPAIAN PEKERJAAN</w:t>
       </w:r>
     </w:p>
@@ -6167,11 +6154,6 @@
           <w:sz w:val="24"/>
           <w:szCs w:val="24"/>
         </w:rPr>
-        <w:sectPr>
-          <w:pgSz w:w="15840" w:h="12240" w:orient="landscape"/>
-          <w:pgMar w:top="1440" w:right="1440" w:bottom="1440" w:left="1440" w:header="708" w:footer="708" w:gutter="0"/>
-          <w:cols w:space="720"/>
-        </w:sectPr>
       </w:pPr>
       <w:r>
         <w:rPr>
@@ -6203,9 +6185,6 @@
     </w:p>
     <w:p>
       <w:pPr>
-        <w:spacing w:after="0" w:line="240" w:lineRule="auto"/>
-        <w:ind w:left="360"/>
-        <w:jc w:val="center"/>
         <w:rPr>
           <w:rFonts w:ascii="Bookman Old Style" w:eastAsia="Bookman Old Style" w:hAnsi="Bookman Old Style" w:cs="Bookman Old Style"/>
           <w:color w:val="FF0000"/>
@@ -6213,12 +6192,20 @@
           <w:szCs w:val="24"/>
         </w:rPr>
       </w:pPr>
+      <w:r>
+        <w:rPr>
+          <w:rFonts w:ascii="Bookman Old Style" w:eastAsia="Bookman Old Style" w:hAnsi="Bookman Old Style" w:cs="Bookman Old Style"/>
+          <w:color w:val="FF0000"/>
+          <w:sz w:val="24"/>
+          <w:szCs w:val="24"/>
+        </w:rPr>
+        <w:br w:type="page"/>
+      </w:r>
     </w:p>
     <w:p>
       <w:pPr>
         <w:widowControl w:val="0"/>
         <w:spacing w:after="0" w:line="240" w:lineRule="auto"/>
-        <w:ind w:left="360"/>
         <w:rPr>
           <w:rFonts w:ascii="Bookman Old Style" w:eastAsia="Bookman Old Style" w:hAnsi="Bookman Old Style" w:cs="Bookman Old Style"/>
           <w:sz w:val="24"/>

</xml_diff>